<commit_message>
Corrige ancho de tabla del documento para Word
</commit_message>
<xml_diff>
--- a/documentos/El_cartero_inteligente.docx
+++ b/documentos/El_cartero_inteligente.docx
@@ -30,9 +30,10 @@
     </w:p>
     <w:tbl>
       <w:tblPr>
-        <w:tblW w:type="auto" w:w="0"/>
+        <w:tblW w:type="dxa" w:w="10080"/>
         <w:tblLayout w:type="fixed"/>
         <w:tblLook w:firstColumn="1" w:firstRow="1" w:lastColumn="0" w:lastRow="0" w:noHBand="0" w:noVBand="1" w:val="04A0"/>
+        <w:tblInd w:w="0" w:type="dxa"/>
       </w:tblPr>
       <w:tblGrid>
         <w:gridCol w:w="2088"/>
@@ -41,7 +42,7 @@
       <w:tr>
         <w:tc>
           <w:tcPr>
-            <w:tcW w:type="dxa" w:w="5040"/>
+            <w:tcW w:type="dxa" w:w="2088"/>
             <w:shd w:fill="DCE6F1"/>
             <w:tcBorders>
               <w:top w:val="single" w:sz="4" w:color="D9D9D9"/>
@@ -72,7 +73,7 @@
         </w:tc>
         <w:tc>
           <w:tcPr>
-            <w:tcW w:type="dxa" w:w="5040"/>
+            <w:tcW w:type="dxa" w:w="7992"/>
             <w:shd w:fill="DCE6F1"/>
             <w:tcBorders>
               <w:top w:val="single" w:sz="4" w:color="D9D9D9"/>

</xml_diff>